<commit_message>
Update business information and branding across the website and legal documents
Replaces all instances of "Ripley & Ripley Research" with "R&R Droids", updates contact information, and refreshes website color scheme.

Replit-Commit-Author: Agent
Replit-Commit-Session-Id: daa159bb-befa-4c30-b40e-a9d5ca242b92
Replit-Commit-Checkpoint-Type: full_checkpoint
Replit-Commit-Event-Id: a051bd63-6c1c-4c6c-b030-55c0e1f2b14e
Replit-Commit-Screenshot-Url: https://storage.googleapis.com/screenshot-production-us-central1/b97799d8-b479-4e98-b492-e695dd913dfb/daa159bb-befa-4c30-b40e-a9d5ca242b92/JbS3mYk
Replit-Helium-Checkpoint-Created: true
</commit_message>
<xml_diff>
--- a/legal-docs/RipleyResearch_MutualNDA_Template.docx
+++ b/legal-docs/RipleyResearch_MutualNDA_Template.docx
@@ -40,7 +40,7 @@
           <w:sz w:val="24"/>
           <w:szCs w:val="24"/>
         </w:rPr>
-        <w:t xml:space="preserve">Ripley &amp; Ripley Research / QAG Framework</w:t>
+        <w:t xml:space="preserve">R&amp;R Droids / QAG Framework</w:t>
       </w:r>
     </w:p>
     <w:p>
@@ -64,7 +64,7 @@
           <w:sz w:val="20"/>
           <w:szCs w:val="20"/>
         </w:rPr>
-        <w:t xml:space="preserve">DISCLAIMER: This is a template document for informational purposes only and does not constitute legal advice. Consult a licensed attorney before execution. (c) 2026 Rodney A. Ripley Jr. / Ripley &amp; Ripley Research.</w:t>
+        <w:t xml:space="preserve">DISCLAIMER: This is a template document for informational purposes only and does not constitute legal advice. Consult a licensed attorney before execution. (c) 2026 Rodney A. Ripley Jr. / R&amp;R Droids.</w:t>
       </w:r>
     </w:p>
     <w:p>
@@ -83,7 +83,7 @@
           <w:sz w:val="24"/>
           <w:szCs w:val="24"/>
         </w:rPr>
-        <w:t xml:space="preserve">This Mutual Non-Disclosure Agreement (this 'Agreement') is entered into as of [EFFECTIVE DATE] by and between: Rodney A. Ripley Jr. / Ripley &amp; Ripley Research ('Disclosing Party'); and [COUNTERPARTY FULL LEGAL NAME], a [corporation/university/government agency] organized under the laws of [JURISDICTION] ('Recipient'). Each may be referred to as a 'Party' and collectively as the 'Parties.'</w:t>
+        <w:t xml:space="preserve">This Mutual Non-Disclosure Agreement (this 'Agreement') is entered into as of [EFFECTIVE DATE] by and between: Rodney A. Ripley Jr. / R&amp;R Droids ('Disclosing Party'); and [COUNTERPARTY FULL LEGAL NAME], a [corporation/university/government agency] organized under the laws of [JURISDICTION] ('Recipient'). Each may be referred to as a 'Party' and collectively as the 'Parties.'</w:t>
       </w:r>
     </w:p>
     <w:p>
@@ -112,7 +112,7 @@
           <w:sz w:val="24"/>
           <w:szCs w:val="24"/>
         </w:rPr>
-        <w:t xml:space="preserve">'Confidential Information' means any non-public information disclosed by one Party to the other, whether in written, oral, electronic, or other form, that is designated as confidential or that reasonably should be understood to be confidential. Without limiting the foregoing, Confidential Information of Ripley &amp; Ripley Research includes:</w:t>
+        <w:t xml:space="preserve">'Confidential Information' means any non-public information disclosed by one Party to the other, whether in written, oral, electronic, or other form, that is designated as confidential or that reasonably should be understood to be confidential. Without limiting the foregoing, Confidential Information of R&amp;R Droids includes:</w:t>
       </w:r>
     </w:p>
     <w:p>
@@ -459,7 +459,7 @@
           <w:sz w:val="24"/>
           <w:szCs w:val="24"/>
         </w:rPr>
-        <w:t xml:space="preserve">Nothing in this Agreement shall be construed as granting any license, right, title, or interest in any patent, copyright, trademark, or other intellectual property right. All Confidential Information remains the exclusive property of the Disclosing Party. The QAG theoretical framework, QAG-V2 constants, Resonant Codex, and all associated outputs are the intellectual property of Rodney A. Ripley Jr. / Ripley &amp; Ripley Research, protected under copyright and applicable IP law. Any commercial, academic, or governmental exploitation requires a separate executed License Agreement.</w:t>
+        <w:t xml:space="preserve">Nothing in this Agreement shall be construed as granting any license, right, title, or interest in any patent, copyright, trademark, or other intellectual property right. All Confidential Information remains the exclusive property of the Disclosing Party. The QAG theoretical framework, QAG-V2 constants, Resonant Codex, and all associated outputs are the intellectual property of Rodney A. Ripley Jr. / R&amp;R Droids, protected under copyright and applicable IP law. Any commercial, academic, or governmental exploitation requires a separate executed License Agreement.</w:t>
       </w:r>
     </w:p>
     <w:p>
@@ -742,7 +742,7 @@
                 <w:sz w:val="24"/>
                 <w:szCs w:val="24"/>
               </w:rPr>
-              <w:t xml:space="preserve">LICENSOR: Ripley &amp; Ripley Research</w:t>
+              <w:t xml:space="preserve">LICENSOR: R&amp;R Droids</w:t>
             </w:r>
           </w:p>
           <w:p>

</xml_diff>